<commit_message>
Shorten postponement motion to 5 core clauses
Co-Authored-By: Claude Opus 5.5 <noreply@anthropic.com>
Claude-Session: https://claude.ai/code/session_01X2dWpFvKMWGhyMerEdsYcF
</commit_message>
<xml_diff>
--- a/hearing-postponement-request/בקשה מוסכמת לדחיית דיון - מילואים.docx
+++ b/hearing-postponement-request/בקשה מוסכמת לדחיית דיון - מילואים.docx
@@ -475,98 +475,7 @@
           <w:szCs w:val="24"/>
           <w:rtl/>
         </w:rPr>
-        <w:t xml:space="preserve">המבקשת, באמצעות באי כוחה ובהסכמת המשיב, מתכבדת לעתור לבית המשפט הנכבד לדחות את הדיון הקבוע בתיק ליום 5.10.2026, ולקבוע אותו לאחד המועדים המוסכמים שלהלן:</w:t>
-      </w:r>
-    </w:p>
-    <w:p>
-      <w:pPr>
-        <w:bidi/>
-        <w:spacing w:after="60" w:before="0" w:line="360" w:lineRule="auto"/>
-        <w:ind w:start="720"/>
-        <w:jc w:val="both"/>
-      </w:pPr>
-      <w:r>
-        <w:rPr>
-          <w:rFonts w:ascii="David" w:cs="David" w:eastAsia="David" w:hAnsi="David"/>
-          <w:b/>
-          <w:bCs/>
-          <w:sz w:val="24"/>
-          <w:szCs w:val="24"/>
-          <w:rtl/>
-        </w:rPr>
-        <w:t xml:space="preserve">א.  </w:t>
-      </w:r>
-      <w:r>
-        <w:rPr>
-          <w:rFonts w:ascii="David" w:cs="David" w:eastAsia="David" w:hAnsi="David"/>
-          <w:sz w:val="24"/>
-          <w:szCs w:val="24"/>
-          <w:rtl/>
-        </w:rPr>
-        <w:t xml:space="preserve">יום רביעי, 7.10.2026, בשעות הבוקר ועד השעה 11:00;</w:t>
-      </w:r>
-    </w:p>
-    <w:p>
-      <w:pPr>
-        <w:bidi/>
-        <w:spacing w:after="120" w:before="0" w:line="360" w:lineRule="auto"/>
-        <w:ind w:start="720"/>
-        <w:jc w:val="both"/>
-      </w:pPr>
-      <w:r>
-        <w:rPr>
-          <w:rFonts w:ascii="David" w:cs="David" w:eastAsia="David" w:hAnsi="David"/>
-          <w:b/>
-          <w:bCs/>
-          <w:sz w:val="24"/>
-          <w:szCs w:val="24"/>
-          <w:rtl/>
-        </w:rPr>
-        <w:t xml:space="preserve">ב.  </w:t>
-      </w:r>
-      <w:r>
-        <w:rPr>
-          <w:rFonts w:ascii="David" w:cs="David" w:eastAsia="David" w:hAnsi="David"/>
-          <w:sz w:val="24"/>
-          <w:szCs w:val="24"/>
-          <w:rtl/>
-        </w:rPr>
-        <w:t xml:space="preserve">יום שני, 12.10.2026.</w:t>
-      </w:r>
-    </w:p>
-    <w:p>
-      <w:pPr>
-        <w:bidi/>
-        <w:spacing w:after="240" w:before="0" w:line="360" w:lineRule="auto"/>
-        <w:jc w:val="both"/>
-      </w:pPr>
-      <w:r>
-        <w:rPr>
-          <w:rFonts w:ascii="David" w:cs="David" w:eastAsia="David" w:hAnsi="David"/>
-          <w:sz w:val="24"/>
-          <w:szCs w:val="24"/>
-          <w:rtl/>
-        </w:rPr>
-        <w:t xml:space="preserve">לחלופין, ככל שמועדים אלה אינם מתאפשרים ביומנו של בית המשפט הנכבד, מתבקש בית המשפט לקבוע את הדיון למועד שלאחר יום 5.11.2026, הוא מועד סיום שירות המילואים של המבקשת.</w:t>
-      </w:r>
-    </w:p>
-    <w:p>
-      <w:pPr>
-        <w:bidi/>
-        <w:spacing w:after="120" w:before="0" w:line="360" w:lineRule="auto"/>
-        <w:jc w:val="start"/>
-      </w:pPr>
-      <w:r>
-        <w:rPr>
-          <w:rFonts w:ascii="David" w:cs="David" w:eastAsia="David" w:hAnsi="David"/>
-          <w:b/>
-          <w:bCs/>
-          <w:sz w:val="24"/>
-          <w:szCs w:val="24"/>
-          <w:u w:val="single"/>
-          <w:rtl/>
-        </w:rPr>
-        <w:t xml:space="preserve">ואלה נימוקי הבקשה:</w:t>
+        <w:t xml:space="preserve">המבקשת, באמצעות באי כוחה ובהסכמת המשיב, מתכבדת לעתור לבית המשפט הנכבד לדחות את הדיון הקבוע ליום 5.10.2026, ואלה נימוקי הבקשה:</w:t>
       </w:r>
     </w:p>
     <w:p>
@@ -587,7 +496,27 @@
           <w:szCs w:val="24"/>
           <w:rtl/>
         </w:rPr>
-        <w:t xml:space="preserve">בתיק שבכותרת קבוע דיון ליום 5.10.2026 [בשעה ______].</w:t>
+        <w:t xml:space="preserve">המבקשת משרתת בשירות מילואים פעיל מכוח צו קריאה בשעת חירום (צו 8) בגבול מצרים, עד ליום 5.11.2026, ולכן אינה יכולה להתייצב לדיון. אישור המילואים מצורף ומסומן </w:t>
+      </w:r>
+      <w:r>
+        <w:rPr>
+          <w:rFonts w:ascii="David" w:cs="David" w:eastAsia="David" w:hAnsi="David"/>
+          <w:b/>
+          <w:bCs/>
+          <w:sz w:val="24"/>
+          <w:szCs w:val="24"/>
+          <w:rtl/>
+        </w:rPr>
+        <w:t xml:space="preserve">נספח א'</w:t>
+      </w:r>
+      <w:r>
+        <w:rPr>
+          <w:rFonts w:ascii="David" w:cs="David" w:eastAsia="David" w:hAnsi="David"/>
+          <w:sz w:val="24"/>
+          <w:szCs w:val="24"/>
+          <w:rtl/>
+        </w:rPr>
+        <w:t xml:space="preserve">.</w:t>
       </w:r>
     </w:p>
     <w:p>
@@ -608,7 +537,7 @@
           <w:szCs w:val="24"/>
           <w:rtl/>
         </w:rPr>
-        <w:t xml:space="preserve">המבקשת נקראה לשירות מילואים פעיל מכוח צו קריאה בשעת חירום (צו 8), והיא משרתת בימים אלה בגבול מצרים. שירות המילואים צפוי להסתיים ביום 5.11.2026.</w:t>
+        <w:t xml:space="preserve">למבקשת אושרה חופשה קצרה בת שבוע ימים החל מיום 6.10.2026. זהו חלון הזמנים היחיד שבו תוכל להתייצב לדיון עד לסיום שירותה.</w:t>
       </w:r>
     </w:p>
     <w:p>
@@ -629,7 +558,7 @@
           <w:szCs w:val="24"/>
           <w:rtl/>
         </w:rPr>
-        <w:t xml:space="preserve">אישור על שירות המילואים של המבקשת מצורף לבקשה זו ומסומן </w:t>
+        <w:t xml:space="preserve">באי כוח הצדדים תיאמו ביניהם שני מועדים חלופיים בתוך חלון זמנים זה, ולא נמצאו מועדים נוספים: </w:t>
       </w:r>
       <w:r>
         <w:rPr>
@@ -640,7 +569,27 @@
           <w:szCs w:val="24"/>
           <w:rtl/>
         </w:rPr>
-        <w:t xml:space="preserve">נספח א'</w:t>
+        <w:t xml:space="preserve">יום רביעי, 7.10.2026</w:t>
+      </w:r>
+      <w:r>
+        <w:rPr>
+          <w:rFonts w:ascii="David" w:cs="David" w:eastAsia="David" w:hAnsi="David"/>
+          <w:sz w:val="24"/>
+          <w:szCs w:val="24"/>
+          <w:rtl/>
+        </w:rPr>
+        <w:t xml:space="preserve">, בשעות הבוקר ועד השעה 11:00 (מגבלת זמינותה של ב"כ המשיב), או </w:t>
+      </w:r>
+      <w:r>
+        <w:rPr>
+          <w:rFonts w:ascii="David" w:cs="David" w:eastAsia="David" w:hAnsi="David"/>
+          <w:b/>
+          <w:bCs/>
+          <w:sz w:val="24"/>
+          <w:szCs w:val="24"/>
+          <w:rtl/>
+        </w:rPr>
+        <w:t xml:space="preserve">יום שני, 12.10.2026</w:t>
       </w:r>
       <w:r>
         <w:rPr>
@@ -666,11 +615,22 @@
       <w:r>
         <w:rPr>
           <w:rFonts w:ascii="David" w:cs="David" w:eastAsia="David" w:hAnsi="David"/>
-          <w:sz w:val="24"/>
-          <w:szCs w:val="24"/>
-          <w:rtl/>
-        </w:rPr>
-        <w:t xml:space="preserve">בשל שירותה, המבקשת אינה יכולה להתייצב לדיון הקבוע ליום 5.10.2026.</w:t>
+          <w:b/>
+          <w:bCs/>
+          <w:sz w:val="24"/>
+          <w:szCs w:val="24"/>
+          <w:rtl/>
+        </w:rPr>
+        <w:t xml:space="preserve">לחלופין</w:t>
+      </w:r>
+      <w:r>
+        <w:rPr>
+          <w:rFonts w:ascii="David" w:cs="David" w:eastAsia="David" w:hAnsi="David"/>
+          <w:sz w:val="24"/>
+          <w:szCs w:val="24"/>
+          <w:rtl/>
+        </w:rPr>
+        <w:t xml:space="preserve">, ככל שמועדים אלה אינם מתאפשרים ביומנו של בית המשפט הנכבד, מתבקש בית המשפט לקבוע את הדיון למועד שלאחר יום 5.11.2026, עם סיום שירות המילואים.</w:t>
       </w:r>
     </w:p>
     <w:p>
@@ -691,218 +651,7 @@
           <w:szCs w:val="24"/>
           <w:rtl/>
         </w:rPr>
-        <w:t xml:space="preserve">במהלך השירות אושרה למבקשת חופשה קצרה בת שבוע ימים, החל מיום 6.10.2026. זהו חלון הזמנים היחיד שבו תוכל המבקשת להתייצב לדיון עד לסיום שירותה.</w:t>
-      </w:r>
-    </w:p>
-    <w:p>
-      <w:pPr>
-        <w:pStyle w:val="ListParagraph"/>
-        <w:numPr>
-          <w:ilvl w:val="0"/>
-          <w:numId w:val="2"/>
-        </w:numPr>
-        <w:bidi/>
-        <w:spacing w:after="120" w:before="0" w:line="360" w:lineRule="auto"/>
-        <w:jc w:val="both"/>
-      </w:pPr>
-      <w:r>
-        <w:rPr>
-          <w:rFonts w:ascii="David" w:cs="David" w:eastAsia="David" w:hAnsi="David"/>
-          <w:sz w:val="24"/>
-          <w:szCs w:val="24"/>
-          <w:rtl/>
-        </w:rPr>
-        <w:t xml:space="preserve">באי כוח הצדדים תיאמו ביניהם מועדים חלופיים בתוך חלון זמנים זה, ונמצאו שני מועדים המתאימים לשני הצדדים:</w:t>
-      </w:r>
-    </w:p>
-    <w:p>
-      <w:pPr>
-        <w:pStyle w:val="ListParagraph"/>
-        <w:numPr>
-          <w:ilvl w:val="1"/>
-          <w:numId w:val="2"/>
-        </w:numPr>
-        <w:bidi/>
-        <w:spacing w:after="120" w:before="0" w:line="360" w:lineRule="auto"/>
-        <w:jc w:val="both"/>
-      </w:pPr>
-      <w:r>
-        <w:rPr>
-          <w:rFonts w:ascii="David" w:cs="David" w:eastAsia="David" w:hAnsi="David"/>
-          <w:b/>
-          <w:bCs/>
-          <w:sz w:val="24"/>
-          <w:szCs w:val="24"/>
-          <w:rtl/>
-        </w:rPr>
-        <w:t xml:space="preserve">יום רביעי, 7.10.2026</w:t>
-      </w:r>
-      <w:r>
-        <w:rPr>
-          <w:rFonts w:ascii="David" w:cs="David" w:eastAsia="David" w:hAnsi="David"/>
-          <w:sz w:val="24"/>
-          <w:szCs w:val="24"/>
-          <w:rtl/>
-        </w:rPr>
-        <w:t xml:space="preserve"> - בשעות הבוקר ועד השעה 11:00, שכן זו מגבלת זמינותה של ב"כ המשיב באותו יום;</w:t>
-      </w:r>
-    </w:p>
-    <w:p>
-      <w:pPr>
-        <w:pStyle w:val="ListParagraph"/>
-        <w:numPr>
-          <w:ilvl w:val="1"/>
-          <w:numId w:val="2"/>
-        </w:numPr>
-        <w:bidi/>
-        <w:spacing w:after="120" w:before="0" w:line="360" w:lineRule="auto"/>
-        <w:jc w:val="both"/>
-      </w:pPr>
-      <w:r>
-        <w:rPr>
-          <w:rFonts w:ascii="David" w:cs="David" w:eastAsia="David" w:hAnsi="David"/>
-          <w:b/>
-          <w:bCs/>
-          <w:sz w:val="24"/>
-          <w:szCs w:val="24"/>
-          <w:rtl/>
-        </w:rPr>
-        <w:t xml:space="preserve">יום שני, 12.10.2026</w:t>
-      </w:r>
-      <w:r>
-        <w:rPr>
-          <w:rFonts w:ascii="David" w:cs="David" w:eastAsia="David" w:hAnsi="David"/>
-          <w:sz w:val="24"/>
-          <w:szCs w:val="24"/>
-          <w:rtl/>
-        </w:rPr>
-        <w:t xml:space="preserve">.</w:t>
-      </w:r>
-    </w:p>
-    <w:p>
-      <w:pPr>
-        <w:pStyle w:val="ListParagraph"/>
-        <w:numPr>
-          <w:ilvl w:val="0"/>
-          <w:numId w:val="2"/>
-        </w:numPr>
-        <w:bidi/>
-        <w:spacing w:after="120" w:before="0" w:line="360" w:lineRule="auto"/>
-        <w:jc w:val="both"/>
-      </w:pPr>
-      <w:r>
-        <w:rPr>
-          <w:rFonts w:ascii="David" w:cs="David" w:eastAsia="David" w:hAnsi="David"/>
-          <w:sz w:val="24"/>
-          <w:szCs w:val="24"/>
-          <w:rtl/>
-        </w:rPr>
-        <w:t xml:space="preserve">הצדדים בדקו אפשרות למועדים נוספים בתוך תקופת החופשה, אך לא נמצאו מועדים נוספים המתאימים לשניהם.</w:t>
-      </w:r>
-    </w:p>
-    <w:p>
-      <w:pPr>
-        <w:pStyle w:val="ListParagraph"/>
-        <w:numPr>
-          <w:ilvl w:val="0"/>
-          <w:numId w:val="2"/>
-        </w:numPr>
-        <w:bidi/>
-        <w:spacing w:after="120" w:before="0" w:line="360" w:lineRule="auto"/>
-        <w:jc w:val="both"/>
-      </w:pPr>
-      <w:r>
-        <w:rPr>
-          <w:rFonts w:ascii="David" w:cs="David" w:eastAsia="David" w:hAnsi="David"/>
-          <w:sz w:val="24"/>
-          <w:szCs w:val="24"/>
-          <w:rtl/>
-        </w:rPr>
-        <w:t xml:space="preserve">ככל שמועדים אלה אינם מתאפשרים ביומנו של בית המשפט הנכבד, המבקשת תוכל להתייצב לדיון בכל מועד שלאחר יום 5.11.2026, עם סיום שירות המילואים.</w:t>
-      </w:r>
-    </w:p>
-    <w:p>
-      <w:pPr>
-        <w:pStyle w:val="ListParagraph"/>
-        <w:numPr>
-          <w:ilvl w:val="0"/>
-          <w:numId w:val="2"/>
-        </w:numPr>
-        <w:bidi/>
-        <w:spacing w:after="120" w:before="0" w:line="360" w:lineRule="auto"/>
-        <w:jc w:val="both"/>
-      </w:pPr>
-      <w:r>
-        <w:rPr>
-          <w:rFonts w:ascii="David" w:cs="David" w:eastAsia="David" w:hAnsi="David"/>
-          <w:sz w:val="24"/>
-          <w:szCs w:val="24"/>
-          <w:rtl/>
-        </w:rPr>
-        <w:t xml:space="preserve">הבקשה מוגשת בהסכמת המשיב, באמצעות באת כוחו.</w:t>
-      </w:r>
-    </w:p>
-    <w:p>
-      <w:pPr>
-        <w:pStyle w:val="ListParagraph"/>
-        <w:numPr>
-          <w:ilvl w:val="0"/>
-          <w:numId w:val="2"/>
-        </w:numPr>
-        <w:bidi/>
-        <w:spacing w:after="120" w:before="0" w:line="360" w:lineRule="auto"/>
-        <w:jc w:val="both"/>
-      </w:pPr>
-      <w:r>
-        <w:rPr>
-          <w:rFonts w:ascii="David" w:cs="David" w:eastAsia="David" w:hAnsi="David"/>
-          <w:sz w:val="24"/>
-          <w:szCs w:val="24"/>
-          <w:rtl/>
-        </w:rPr>
-        <w:t xml:space="preserve">הבקשה מוגשת בסמוך למועד הדיון, מיד לאחר שהושלם תיאום המועדים בין הצדדים. [זוהי בקשת הדחייה הראשונה בתיק.] דחיית הדיון למועדים המוצעים, בתוך ימים ספורים, לא תעכב באופן ממשי את בירור ההליך ולא תפגע באיש מהצדדים.</w:t>
-      </w:r>
-    </w:p>
-    <w:p>
-      <w:pPr>
-        <w:pStyle w:val="ListParagraph"/>
-        <w:numPr>
-          <w:ilvl w:val="0"/>
-          <w:numId w:val="2"/>
-        </w:numPr>
-        <w:bidi/>
-        <w:spacing w:after="120" w:before="0" w:line="360" w:lineRule="auto"/>
-        <w:jc w:val="both"/>
-      </w:pPr>
-      <w:r>
-        <w:rPr>
-          <w:rFonts w:ascii="David" w:cs="David" w:eastAsia="David" w:hAnsi="David"/>
-          <w:sz w:val="24"/>
-          <w:szCs w:val="24"/>
-          <w:rtl/>
-        </w:rPr>
-        <w:t xml:space="preserve">נוכח מועד הדיון הקרוב, מתבקש בית המשפט הנכבד ליתן את החלטתו בבקשה בהקדם.</w:t>
-      </w:r>
-    </w:p>
-    <w:p>
-      <w:pPr>
-        <w:pStyle w:val="ListParagraph"/>
-        <w:numPr>
-          <w:ilvl w:val="0"/>
-          <w:numId w:val="2"/>
-        </w:numPr>
-        <w:bidi/>
-        <w:spacing w:after="120" w:before="0" w:line="360" w:lineRule="auto"/>
-        <w:jc w:val="both"/>
-      </w:pPr>
-      <w:r>
-        <w:rPr>
-          <w:rFonts w:ascii="David" w:cs="David" w:eastAsia="David" w:hAnsi="David"/>
-          <w:sz w:val="24"/>
-          <w:szCs w:val="24"/>
-          <w:rtl/>
-        </w:rPr>
-        <w:t xml:space="preserve">לאור כל האמור, מתבקש בית המשפט הנכבד להיעתר לבקשה כמבוקש ברישא.</w:t>
+        <w:t xml:space="preserve">הבקשה מוגשת בהסכמת המשיב. נוכח מועד הדיון הקרוב, מתבקש בית המשפט הנכבד ליתן את החלטתו בבקשה בהקדם.</w:t>
       </w:r>
     </w:p>
     <w:p>

</xml_diff>